<commit_message>
Proje son haline getirildi
</commit_message>
<xml_diff>
--- a/Rapor.docx
+++ b/Rapor.docx
@@ -115,48 +115,6 @@
         </w:rPr>
         <w:t>https://github.com/Mervesenae/WebTeknolojileriProjesi</w:t>
       </w:r>
-    </w:p>
-    <w:p>
-      <w:pPr>
-        <w:rPr>
-          <w:sz w:val="28"/>
-          <w:szCs w:val="28"/>
-        </w:rPr>
-      </w:pPr>
-      <w:hyperlink r:id="rId5" w:history="1"/>
-      <w:r>
-        <w:rPr>
-          <w:sz w:val="28"/>
-          <w:szCs w:val="28"/>
-        </w:rPr>
-        <w:t xml:space="preserve"> </w:t>
-      </w:r>
-      <w:hyperlink r:id="rId6" w:history="1">
-        <w:r>
-          <w:rPr>
-            <w:rStyle w:val="Kpr"/>
-            <w:sz w:val="28"/>
-            <w:szCs w:val="28"/>
-          </w:rPr>
-          <w:t>Canlı Site</w:t>
-        </w:r>
-        <w:r>
-          <w:rPr>
-            <w:rStyle w:val="Kpr"/>
-            <w:sz w:val="28"/>
-            <w:szCs w:val="28"/>
-          </w:rPr>
-          <w:t xml:space="preserve"> </w:t>
-        </w:r>
-        <w:r>
-          <w:rPr>
-            <w:rStyle w:val="Kpr"/>
-            <w:sz w:val="28"/>
-            <w:szCs w:val="28"/>
-          </w:rPr>
-          <w:t>Linki</w:t>
-        </w:r>
-      </w:hyperlink>
     </w:p>
     <w:p>
       <w:pPr>

</xml_diff>